<commit_message>
Added Constraints, engineering decision logs and AI usage register to the PED
</commit_message>
<xml_diff>
--- a/docs/PED/CivicConnect_PED_v0.1.docx
+++ b/docs/PED/CivicConnect_PED_v0.1.docx
@@ -162,7 +162,6 @@
                                     <w:dataBinding w:prefixMappings="xmlns:ns0='http://purl.org/dc/elements/1.1/' xmlns:ns1='http://schemas.openxmlformats.org/package/2006/metadata/core-properties' " w:xpath="/ns1:coreProperties[1]/ns0:subject[1]" w:storeItemID="{6C3C8BC8-F283-45AE-878A-BAB7291924A1}"/>
                                     <w:text/>
                                   </w:sdtPr>
-                                  <w:sdtEndPr/>
                                   <w:sdtContent>
                                     <w:r>
                                       <w:rPr>
@@ -279,23 +278,7 @@
                                     <w:sz w:val="28"/>
                                     <w:szCs w:val="28"/>
                                   </w:rPr>
-                                  <w:t xml:space="preserve">Hermanus Jacobus </w:t>
-                                </w:r>
-                                <w:proofErr w:type="spellStart"/>
-                                <w:r>
-                                  <w:rPr>
-                                    <w:sz w:val="28"/>
-                                    <w:szCs w:val="28"/>
-                                  </w:rPr>
-                                  <w:t>Bantjes</w:t>
-                                </w:r>
-                                <w:proofErr w:type="spellEnd"/>
-                                <w:r>
-                                  <w:rPr>
-                                    <w:sz w:val="28"/>
-                                    <w:szCs w:val="28"/>
-                                  </w:rPr>
-                                  <w:t xml:space="preserve"> (601427)</w:t>
+                                  <w:t>Hermanus Jacobus Bantjes (601427)</w:t>
                                 </w:r>
                               </w:p>
                               <w:p>
@@ -3586,6 +3569,9 @@
         <w:spacing w:line="360" w:lineRule="auto"/>
       </w:pPr>
       <w:r>
+        <w:rPr>
+          <w:noProof/>
+        </w:rPr>
         <w:drawing>
           <wp:inline distT="0" distB="0" distL="0" distR="0" wp14:anchorId="7C1345D1" wp14:editId="18508D4E">
             <wp:extent cx="4933950" cy="2423160"/>
@@ -6144,6 +6130,7 @@
       </w:pPr>
       <w:r>
         <w:rPr>
+          <w:noProof/>
           <w:sz w:val="28"/>
           <w:szCs w:val="28"/>
         </w:rPr>
@@ -6643,14 +6630,7 @@
           <w:sz w:val="28"/>
           <w:szCs w:val="28"/>
         </w:rPr>
-        <w:t>Predictive service-demand analysis</w:t>
-      </w:r>
-      <w:r>
-        <w:rPr>
-          <w:sz w:val="28"/>
-          <w:szCs w:val="28"/>
-        </w:rPr>
-        <w:t xml:space="preserve"> procedures.</w:t>
+        <w:t>Predictive service-demand analysis procedures.</w:t>
       </w:r>
     </w:p>
     <w:p>
@@ -7975,10 +7955,7 @@
               <w:spacing w:line="360" w:lineRule="auto"/>
             </w:pPr>
             <w:r>
-              <w:t>CAP-STF-00</w:t>
-            </w:r>
-            <w:r>
-              <w:t>3</w:t>
+              <w:t>CAP-STF-003</w:t>
             </w:r>
           </w:p>
         </w:tc>
@@ -8036,10 +8013,7 @@
               <w:spacing w:line="360" w:lineRule="auto"/>
             </w:pPr>
             <w:r>
-              <w:t>CAP-STF-00</w:t>
-            </w:r>
-            <w:r>
-              <w:t>4</w:t>
+              <w:t>CAP-STF-004</w:t>
             </w:r>
           </w:p>
         </w:tc>
@@ -8153,10 +8127,7 @@
               <w:spacing w:line="360" w:lineRule="auto"/>
             </w:pPr>
             <w:r>
-              <w:t>CAP-STF-00</w:t>
-            </w:r>
-            <w:r>
-              <w:t>5</w:t>
+              <w:t>CAP-STF-005</w:t>
             </w:r>
           </w:p>
         </w:tc>
@@ -8213,10 +8184,7 @@
               <w:spacing w:line="360" w:lineRule="auto"/>
             </w:pPr>
             <w:r>
-              <w:t>CAP-STF-00</w:t>
-            </w:r>
-            <w:r>
-              <w:t>5</w:t>
+              <w:t>CAP-STF-005</w:t>
             </w:r>
           </w:p>
         </w:tc>
@@ -8273,10 +8241,7 @@
               <w:spacing w:line="360" w:lineRule="auto"/>
             </w:pPr>
             <w:r>
-              <w:t>CAP-STF-00</w:t>
-            </w:r>
-            <w:r>
-              <w:t>6</w:t>
+              <w:t>CAP-STF-006</w:t>
             </w:r>
           </w:p>
         </w:tc>
@@ -8850,10 +8815,7 @@
             </w:pPr>
             <w:r>
               <w:lastRenderedPageBreak/>
-              <w:t>FR-SEC-00</w:t>
-            </w:r>
-            <w:r>
-              <w:t>2</w:t>
+              <w:t>FR-SEC-002</w:t>
             </w:r>
           </w:p>
         </w:tc>
@@ -8907,10 +8869,7 @@
               <w:spacing w:line="360" w:lineRule="auto"/>
             </w:pPr>
             <w:r>
-              <w:t>FR-SEC-00</w:t>
-            </w:r>
-            <w:r>
-              <w:t>3</w:t>
+              <w:t>FR-SEC-003</w:t>
             </w:r>
           </w:p>
         </w:tc>
@@ -8964,10 +8923,7 @@
               <w:spacing w:line="360" w:lineRule="auto"/>
             </w:pPr>
             <w:r>
-              <w:t>FR-SEC-00</w:t>
-            </w:r>
-            <w:r>
-              <w:t>4</w:t>
+              <w:t>FR-SEC-004</w:t>
             </w:r>
           </w:p>
         </w:tc>
@@ -10511,10 +10467,7 @@
               <w:spacing w:line="360" w:lineRule="auto"/>
             </w:pPr>
             <w:r>
-              <w:t>AC-STF-006-</w:t>
-            </w:r>
-            <w:r>
-              <w:t>B</w:t>
+              <w:t>AC-STF-006-B</w:t>
             </w:r>
           </w:p>
         </w:tc>
@@ -11566,6 +11519,1978 @@
         </w:rPr>
         <w:t>Advanced predictive service management</w:t>
       </w:r>
+    </w:p>
+    <w:p>
+      <w:pPr>
+        <w:rPr>
+          <w:sz w:val="28"/>
+          <w:szCs w:val="28"/>
+        </w:rPr>
+      </w:pPr>
+      <w:r>
+        <w:rPr>
+          <w:sz w:val="28"/>
+          <w:szCs w:val="28"/>
+        </w:rPr>
+        <w:br w:type="page"/>
+      </w:r>
+    </w:p>
+    <w:p>
+      <w:pPr>
+        <w:spacing w:line="360" w:lineRule="auto"/>
+        <w:ind w:left="360"/>
+        <w:rPr>
+          <w:sz w:val="28"/>
+          <w:szCs w:val="28"/>
+        </w:rPr>
+      </w:pPr>
+      <w:r>
+        <w:rPr>
+          <w:b/>
+          <w:bCs/>
+          <w:sz w:val="28"/>
+          <w:szCs w:val="28"/>
+        </w:rPr>
+        <w:lastRenderedPageBreak/>
+        <w:t>Constraints</w:t>
+      </w:r>
+    </w:p>
+    <w:p>
+      <w:pPr>
+        <w:spacing w:line="360" w:lineRule="auto"/>
+        <w:ind w:left="360"/>
+        <w:rPr>
+          <w:sz w:val="28"/>
+          <w:szCs w:val="28"/>
+        </w:rPr>
+      </w:pPr>
+      <w:r>
+        <w:rPr>
+          <w:b/>
+          <w:bCs/>
+          <w:sz w:val="28"/>
+          <w:szCs w:val="28"/>
+        </w:rPr>
+        <w:t>1. Team size</w:t>
+      </w:r>
+    </w:p>
+    <w:p>
+      <w:pPr>
+        <w:spacing w:line="360" w:lineRule="auto"/>
+        <w:ind w:left="360"/>
+        <w:rPr>
+          <w:sz w:val="28"/>
+          <w:szCs w:val="28"/>
+        </w:rPr>
+      </w:pPr>
+      <w:r>
+        <w:rPr>
+          <w:sz w:val="28"/>
+          <w:szCs w:val="28"/>
+        </w:rPr>
+        <w:t>Three members, each with their own commits and individual milestone defence.</w:t>
+      </w:r>
+    </w:p>
+    <w:p>
+      <w:pPr>
+        <w:spacing w:line="360" w:lineRule="auto"/>
+        <w:ind w:left="360"/>
+        <w:rPr>
+          <w:sz w:val="28"/>
+          <w:szCs w:val="28"/>
+        </w:rPr>
+      </w:pPr>
+      <w:r>
+        <w:rPr>
+          <w:b/>
+          <w:bCs/>
+          <w:sz w:val="28"/>
+          <w:szCs w:val="28"/>
+        </w:rPr>
+        <w:t>2. Schedule / Deadline</w:t>
+      </w:r>
+    </w:p>
+    <w:p>
+      <w:pPr>
+        <w:spacing w:line="360" w:lineRule="auto"/>
+        <w:ind w:left="360"/>
+        <w:rPr>
+          <w:sz w:val="28"/>
+          <w:szCs w:val="28"/>
+        </w:rPr>
+      </w:pPr>
+      <w:r>
+        <w:rPr>
+          <w:sz w:val="28"/>
+          <w:szCs w:val="28"/>
+        </w:rPr>
+        <w:t>Multiple deadlines for separate milestones, with schedules for work decided by the team.</w:t>
+      </w:r>
+    </w:p>
+    <w:p>
+      <w:pPr>
+        <w:spacing w:line="360" w:lineRule="auto"/>
+        <w:ind w:left="360"/>
+        <w:rPr>
+          <w:sz w:val="28"/>
+          <w:szCs w:val="28"/>
+        </w:rPr>
+      </w:pPr>
+      <w:r>
+        <w:rPr>
+          <w:sz w:val="28"/>
+          <w:szCs w:val="28"/>
+        </w:rPr>
+        <w:t>The project is split into multiple parts classified as milestones. As of 7 September, Milestone 1 needs to be completed and submitted on 9 September 2026, while Milestone 2–4 deadlines have yet to be provided.</w:t>
+      </w:r>
+    </w:p>
+    <w:p>
+      <w:pPr>
+        <w:spacing w:line="360" w:lineRule="auto"/>
+        <w:ind w:left="360"/>
+        <w:rPr>
+          <w:sz w:val="28"/>
+          <w:szCs w:val="28"/>
+        </w:rPr>
+      </w:pPr>
+      <w:r>
+        <w:rPr>
+          <w:b/>
+          <w:bCs/>
+          <w:sz w:val="28"/>
+          <w:szCs w:val="28"/>
+        </w:rPr>
+        <w:t>Main deadlines:</w:t>
+      </w:r>
+    </w:p>
+    <w:tbl>
+      <w:tblPr>
+        <w:tblW w:w="10006" w:type="dxa"/>
+        <w:tblBorders>
+          <w:top w:val="single" w:sz="4" w:space="0" w:color="auto"/>
+          <w:left w:val="single" w:sz="4" w:space="0" w:color="auto"/>
+          <w:bottom w:val="single" w:sz="4" w:space="0" w:color="auto"/>
+          <w:right w:val="single" w:sz="4" w:space="0" w:color="auto"/>
+          <w:insideH w:val="single" w:sz="4" w:space="0" w:color="auto"/>
+          <w:insideV w:val="single" w:sz="4" w:space="0" w:color="auto"/>
+        </w:tblBorders>
+        <w:tblCellMar>
+          <w:left w:w="10" w:type="dxa"/>
+          <w:right w:w="10" w:type="dxa"/>
+        </w:tblCellMar>
+        <w:tblLook w:val="04A0" w:firstRow="1" w:lastRow="0" w:firstColumn="1" w:lastColumn="0" w:noHBand="0" w:noVBand="1"/>
+      </w:tblPr>
+      <w:tblGrid>
+        <w:gridCol w:w="5003"/>
+        <w:gridCol w:w="5003"/>
+      </w:tblGrid>
+      <w:tr>
+        <w:trPr>
+          <w:trHeight w:val="248"/>
+          <w:tblHeader/>
+        </w:trPr>
+        <w:tc>
+          <w:tcPr>
+            <w:tcW w:w="5003" w:type="dxa"/>
+            <w:tcBorders>
+              <w:top w:val="single" w:sz="4" w:space="0" w:color="auto"/>
+              <w:left w:val="single" w:sz="4" w:space="0" w:color="auto"/>
+              <w:bottom w:val="single" w:sz="4" w:space="0" w:color="auto"/>
+              <w:right w:val="single" w:sz="4" w:space="0" w:color="auto"/>
+            </w:tcBorders>
+            <w:tcMar>
+              <w:top w:w="80" w:type="dxa"/>
+              <w:left w:w="100" w:type="dxa"/>
+              <w:bottom w:w="80" w:type="dxa"/>
+              <w:right w:w="100" w:type="dxa"/>
+            </w:tcMar>
+            <w:vAlign w:val="center"/>
+            <w:hideMark/>
+          </w:tcPr>
+          <w:p>
+            <w:pPr>
+              <w:spacing w:line="360" w:lineRule="auto"/>
+              <w:ind w:left="360"/>
+              <w:rPr>
+                <w:sz w:val="28"/>
+                <w:szCs w:val="28"/>
+              </w:rPr>
+            </w:pPr>
+            <w:r>
+              <w:rPr>
+                <w:b/>
+                <w:bCs/>
+                <w:sz w:val="28"/>
+                <w:szCs w:val="28"/>
+              </w:rPr>
+              <w:t>Milestone</w:t>
+            </w:r>
+          </w:p>
+        </w:tc>
+        <w:tc>
+          <w:tcPr>
+            <w:tcW w:w="5003" w:type="dxa"/>
+            <w:tcBorders>
+              <w:top w:val="single" w:sz="4" w:space="0" w:color="auto"/>
+              <w:left w:val="single" w:sz="4" w:space="0" w:color="auto"/>
+              <w:bottom w:val="single" w:sz="4" w:space="0" w:color="auto"/>
+              <w:right w:val="single" w:sz="4" w:space="0" w:color="auto"/>
+            </w:tcBorders>
+            <w:tcMar>
+              <w:top w:w="80" w:type="dxa"/>
+              <w:left w:w="100" w:type="dxa"/>
+              <w:bottom w:w="80" w:type="dxa"/>
+              <w:right w:w="100" w:type="dxa"/>
+            </w:tcMar>
+            <w:vAlign w:val="center"/>
+            <w:hideMark/>
+          </w:tcPr>
+          <w:p>
+            <w:pPr>
+              <w:spacing w:line="360" w:lineRule="auto"/>
+              <w:ind w:left="360"/>
+              <w:rPr>
+                <w:sz w:val="28"/>
+                <w:szCs w:val="28"/>
+              </w:rPr>
+            </w:pPr>
+            <w:r>
+              <w:rPr>
+                <w:b/>
+                <w:bCs/>
+                <w:sz w:val="28"/>
+                <w:szCs w:val="28"/>
+              </w:rPr>
+              <w:t>Deadline</w:t>
+            </w:r>
+          </w:p>
+        </w:tc>
+      </w:tr>
+      <w:tr>
+        <w:trPr>
+          <w:trHeight w:val="254"/>
+        </w:trPr>
+        <w:tc>
+          <w:tcPr>
+            <w:tcW w:w="5003" w:type="dxa"/>
+            <w:tcBorders>
+              <w:top w:val="single" w:sz="4" w:space="0" w:color="auto"/>
+              <w:left w:val="single" w:sz="4" w:space="0" w:color="auto"/>
+              <w:bottom w:val="single" w:sz="4" w:space="0" w:color="auto"/>
+              <w:right w:val="single" w:sz="4" w:space="0" w:color="auto"/>
+            </w:tcBorders>
+            <w:tcMar>
+              <w:top w:w="80" w:type="dxa"/>
+              <w:left w:w="100" w:type="dxa"/>
+              <w:bottom w:w="80" w:type="dxa"/>
+              <w:right w:w="100" w:type="dxa"/>
+            </w:tcMar>
+            <w:vAlign w:val="center"/>
+            <w:hideMark/>
+          </w:tcPr>
+          <w:p>
+            <w:pPr>
+              <w:spacing w:line="360" w:lineRule="auto"/>
+              <w:ind w:left="360"/>
+              <w:rPr>
+                <w:sz w:val="28"/>
+                <w:szCs w:val="28"/>
+              </w:rPr>
+            </w:pPr>
+            <w:r>
+              <w:rPr>
+                <w:sz w:val="28"/>
+                <w:szCs w:val="28"/>
+              </w:rPr>
+              <w:t>Milestone 1</w:t>
+            </w:r>
+          </w:p>
+        </w:tc>
+        <w:tc>
+          <w:tcPr>
+            <w:tcW w:w="5003" w:type="dxa"/>
+            <w:tcBorders>
+              <w:top w:val="single" w:sz="4" w:space="0" w:color="auto"/>
+              <w:left w:val="single" w:sz="4" w:space="0" w:color="auto"/>
+              <w:bottom w:val="single" w:sz="4" w:space="0" w:color="auto"/>
+              <w:right w:val="single" w:sz="4" w:space="0" w:color="auto"/>
+            </w:tcBorders>
+            <w:tcMar>
+              <w:top w:w="80" w:type="dxa"/>
+              <w:left w:w="100" w:type="dxa"/>
+              <w:bottom w:w="80" w:type="dxa"/>
+              <w:right w:w="100" w:type="dxa"/>
+            </w:tcMar>
+            <w:vAlign w:val="center"/>
+            <w:hideMark/>
+          </w:tcPr>
+          <w:p>
+            <w:pPr>
+              <w:spacing w:line="360" w:lineRule="auto"/>
+              <w:ind w:left="360"/>
+              <w:rPr>
+                <w:sz w:val="28"/>
+                <w:szCs w:val="28"/>
+              </w:rPr>
+            </w:pPr>
+            <w:r>
+              <w:rPr>
+                <w:sz w:val="28"/>
+                <w:szCs w:val="28"/>
+              </w:rPr>
+              <w:t>9 September 2026</w:t>
+            </w:r>
+          </w:p>
+        </w:tc>
+      </w:tr>
+      <w:tr>
+        <w:trPr>
+          <w:trHeight w:val="248"/>
+        </w:trPr>
+        <w:tc>
+          <w:tcPr>
+            <w:tcW w:w="5003" w:type="dxa"/>
+            <w:tcBorders>
+              <w:top w:val="single" w:sz="4" w:space="0" w:color="auto"/>
+              <w:left w:val="single" w:sz="4" w:space="0" w:color="auto"/>
+              <w:bottom w:val="single" w:sz="4" w:space="0" w:color="auto"/>
+              <w:right w:val="single" w:sz="4" w:space="0" w:color="auto"/>
+            </w:tcBorders>
+            <w:tcMar>
+              <w:top w:w="80" w:type="dxa"/>
+              <w:left w:w="100" w:type="dxa"/>
+              <w:bottom w:w="80" w:type="dxa"/>
+              <w:right w:w="100" w:type="dxa"/>
+            </w:tcMar>
+            <w:vAlign w:val="center"/>
+            <w:hideMark/>
+          </w:tcPr>
+          <w:p>
+            <w:pPr>
+              <w:spacing w:line="360" w:lineRule="auto"/>
+              <w:ind w:left="360"/>
+              <w:rPr>
+                <w:sz w:val="28"/>
+                <w:szCs w:val="28"/>
+              </w:rPr>
+            </w:pPr>
+            <w:r>
+              <w:rPr>
+                <w:sz w:val="28"/>
+                <w:szCs w:val="28"/>
+              </w:rPr>
+              <w:t>Milestone 2</w:t>
+            </w:r>
+          </w:p>
+        </w:tc>
+        <w:tc>
+          <w:tcPr>
+            <w:tcW w:w="5003" w:type="dxa"/>
+            <w:tcBorders>
+              <w:top w:val="single" w:sz="4" w:space="0" w:color="auto"/>
+              <w:left w:val="single" w:sz="4" w:space="0" w:color="auto"/>
+              <w:bottom w:val="single" w:sz="4" w:space="0" w:color="auto"/>
+              <w:right w:val="single" w:sz="4" w:space="0" w:color="auto"/>
+            </w:tcBorders>
+            <w:tcMar>
+              <w:top w:w="80" w:type="dxa"/>
+              <w:left w:w="100" w:type="dxa"/>
+              <w:bottom w:w="80" w:type="dxa"/>
+              <w:right w:w="100" w:type="dxa"/>
+            </w:tcMar>
+            <w:vAlign w:val="center"/>
+            <w:hideMark/>
+          </w:tcPr>
+          <w:p>
+            <w:pPr>
+              <w:spacing w:line="360" w:lineRule="auto"/>
+              <w:ind w:left="360"/>
+              <w:rPr>
+                <w:sz w:val="28"/>
+                <w:szCs w:val="28"/>
+              </w:rPr>
+            </w:pPr>
+            <w:r>
+              <w:rPr>
+                <w:sz w:val="28"/>
+                <w:szCs w:val="28"/>
+              </w:rPr>
+              <w:t>Unknown as of 7 September</w:t>
+            </w:r>
+          </w:p>
+        </w:tc>
+      </w:tr>
+      <w:tr>
+        <w:trPr>
+          <w:trHeight w:val="248"/>
+        </w:trPr>
+        <w:tc>
+          <w:tcPr>
+            <w:tcW w:w="5003" w:type="dxa"/>
+            <w:tcBorders>
+              <w:top w:val="single" w:sz="4" w:space="0" w:color="auto"/>
+              <w:left w:val="single" w:sz="4" w:space="0" w:color="auto"/>
+              <w:bottom w:val="single" w:sz="4" w:space="0" w:color="auto"/>
+              <w:right w:val="single" w:sz="4" w:space="0" w:color="auto"/>
+            </w:tcBorders>
+            <w:tcMar>
+              <w:top w:w="80" w:type="dxa"/>
+              <w:left w:w="100" w:type="dxa"/>
+              <w:bottom w:w="80" w:type="dxa"/>
+              <w:right w:w="100" w:type="dxa"/>
+            </w:tcMar>
+            <w:vAlign w:val="center"/>
+            <w:hideMark/>
+          </w:tcPr>
+          <w:p>
+            <w:pPr>
+              <w:spacing w:line="360" w:lineRule="auto"/>
+              <w:ind w:left="360"/>
+              <w:rPr>
+                <w:sz w:val="28"/>
+                <w:szCs w:val="28"/>
+              </w:rPr>
+            </w:pPr>
+            <w:r>
+              <w:rPr>
+                <w:sz w:val="28"/>
+                <w:szCs w:val="28"/>
+              </w:rPr>
+              <w:t>Milestone 3</w:t>
+            </w:r>
+          </w:p>
+        </w:tc>
+        <w:tc>
+          <w:tcPr>
+            <w:tcW w:w="5003" w:type="dxa"/>
+            <w:tcBorders>
+              <w:top w:val="single" w:sz="4" w:space="0" w:color="auto"/>
+              <w:left w:val="single" w:sz="4" w:space="0" w:color="auto"/>
+              <w:bottom w:val="single" w:sz="4" w:space="0" w:color="auto"/>
+              <w:right w:val="single" w:sz="4" w:space="0" w:color="auto"/>
+            </w:tcBorders>
+            <w:tcMar>
+              <w:top w:w="80" w:type="dxa"/>
+              <w:left w:w="100" w:type="dxa"/>
+              <w:bottom w:w="80" w:type="dxa"/>
+              <w:right w:w="100" w:type="dxa"/>
+            </w:tcMar>
+            <w:vAlign w:val="center"/>
+            <w:hideMark/>
+          </w:tcPr>
+          <w:p>
+            <w:pPr>
+              <w:spacing w:line="360" w:lineRule="auto"/>
+              <w:ind w:left="360"/>
+              <w:rPr>
+                <w:sz w:val="28"/>
+                <w:szCs w:val="28"/>
+              </w:rPr>
+            </w:pPr>
+            <w:r>
+              <w:rPr>
+                <w:sz w:val="28"/>
+                <w:szCs w:val="28"/>
+              </w:rPr>
+              <w:t>Unknown as of 7 September</w:t>
+            </w:r>
+          </w:p>
+        </w:tc>
+      </w:tr>
+      <w:tr>
+        <w:trPr>
+          <w:trHeight w:val="248"/>
+        </w:trPr>
+        <w:tc>
+          <w:tcPr>
+            <w:tcW w:w="5003" w:type="dxa"/>
+            <w:tcBorders>
+              <w:top w:val="single" w:sz="4" w:space="0" w:color="auto"/>
+              <w:left w:val="single" w:sz="4" w:space="0" w:color="auto"/>
+              <w:bottom w:val="single" w:sz="4" w:space="0" w:color="auto"/>
+              <w:right w:val="single" w:sz="4" w:space="0" w:color="auto"/>
+            </w:tcBorders>
+            <w:tcMar>
+              <w:top w:w="80" w:type="dxa"/>
+              <w:left w:w="100" w:type="dxa"/>
+              <w:bottom w:w="80" w:type="dxa"/>
+              <w:right w:w="100" w:type="dxa"/>
+            </w:tcMar>
+            <w:vAlign w:val="center"/>
+            <w:hideMark/>
+          </w:tcPr>
+          <w:p>
+            <w:pPr>
+              <w:spacing w:line="360" w:lineRule="auto"/>
+              <w:ind w:left="360"/>
+              <w:rPr>
+                <w:sz w:val="28"/>
+                <w:szCs w:val="28"/>
+              </w:rPr>
+            </w:pPr>
+            <w:r>
+              <w:rPr>
+                <w:sz w:val="28"/>
+                <w:szCs w:val="28"/>
+              </w:rPr>
+              <w:t>Milestone 4</w:t>
+            </w:r>
+          </w:p>
+        </w:tc>
+        <w:tc>
+          <w:tcPr>
+            <w:tcW w:w="5003" w:type="dxa"/>
+            <w:tcBorders>
+              <w:top w:val="single" w:sz="4" w:space="0" w:color="auto"/>
+              <w:left w:val="single" w:sz="4" w:space="0" w:color="auto"/>
+              <w:bottom w:val="single" w:sz="4" w:space="0" w:color="auto"/>
+              <w:right w:val="single" w:sz="4" w:space="0" w:color="auto"/>
+            </w:tcBorders>
+            <w:tcMar>
+              <w:top w:w="80" w:type="dxa"/>
+              <w:left w:w="100" w:type="dxa"/>
+              <w:bottom w:w="80" w:type="dxa"/>
+              <w:right w:w="100" w:type="dxa"/>
+            </w:tcMar>
+            <w:vAlign w:val="center"/>
+            <w:hideMark/>
+          </w:tcPr>
+          <w:p>
+            <w:pPr>
+              <w:spacing w:line="360" w:lineRule="auto"/>
+              <w:ind w:left="360"/>
+              <w:rPr>
+                <w:sz w:val="28"/>
+                <w:szCs w:val="28"/>
+              </w:rPr>
+            </w:pPr>
+            <w:r>
+              <w:rPr>
+                <w:sz w:val="28"/>
+                <w:szCs w:val="28"/>
+              </w:rPr>
+              <w:t>Unknown as of 7 September</w:t>
+            </w:r>
+          </w:p>
+        </w:tc>
+      </w:tr>
+    </w:tbl>
+    <w:p>
+      <w:pPr>
+        <w:spacing w:line="360" w:lineRule="auto"/>
+        <w:ind w:left="360"/>
+        <w:rPr>
+          <w:b/>
+          <w:bCs/>
+          <w:sz w:val="28"/>
+          <w:szCs w:val="28"/>
+        </w:rPr>
+      </w:pPr>
+    </w:p>
+    <w:p>
+      <w:pPr>
+        <w:spacing w:line="360" w:lineRule="auto"/>
+        <w:ind w:left="360"/>
+        <w:rPr>
+          <w:sz w:val="28"/>
+          <w:szCs w:val="28"/>
+        </w:rPr>
+      </w:pPr>
+      <w:r>
+        <w:rPr>
+          <w:b/>
+          <w:bCs/>
+          <w:sz w:val="28"/>
+          <w:szCs w:val="28"/>
+        </w:rPr>
+        <w:t>3. Cost</w:t>
+      </w:r>
+    </w:p>
+    <w:p>
+      <w:pPr>
+        <w:spacing w:line="360" w:lineRule="auto"/>
+        <w:ind w:left="360"/>
+        <w:rPr>
+          <w:sz w:val="28"/>
+          <w:szCs w:val="28"/>
+        </w:rPr>
+      </w:pPr>
+      <w:r>
+        <w:rPr>
+          <w:sz w:val="28"/>
+          <w:szCs w:val="28"/>
+        </w:rPr>
+        <w:t>No- to low-cost budget.</w:t>
+      </w:r>
+    </w:p>
+    <w:p>
+      <w:pPr>
+        <w:spacing w:line="360" w:lineRule="auto"/>
+        <w:ind w:left="360"/>
+        <w:rPr>
+          <w:sz w:val="28"/>
+          <w:szCs w:val="28"/>
+        </w:rPr>
+      </w:pPr>
+      <w:r>
+        <w:rPr>
+          <w:sz w:val="28"/>
+          <w:szCs w:val="28"/>
+        </w:rPr>
+        <w:t>Free services preferred.</w:t>
+      </w:r>
+    </w:p>
+    <w:p>
+      <w:pPr>
+        <w:spacing w:line="360" w:lineRule="auto"/>
+        <w:ind w:left="360"/>
+        <w:rPr>
+          <w:sz w:val="28"/>
+          <w:szCs w:val="28"/>
+        </w:rPr>
+      </w:pPr>
+      <w:r>
+        <w:rPr>
+          <w:sz w:val="28"/>
+          <w:szCs w:val="28"/>
+        </w:rPr>
+        <w:t>Technology, hosting, development and other tools need to consider cost, as choices for functionality may be affected by cost.</w:t>
+      </w:r>
+    </w:p>
+    <w:p>
+      <w:pPr>
+        <w:spacing w:line="360" w:lineRule="auto"/>
+        <w:ind w:left="360"/>
+        <w:rPr>
+          <w:sz w:val="28"/>
+          <w:szCs w:val="28"/>
+        </w:rPr>
+      </w:pPr>
+      <w:r>
+        <w:rPr>
+          <w:b/>
+          <w:bCs/>
+          <w:sz w:val="28"/>
+          <w:szCs w:val="28"/>
+        </w:rPr>
+        <w:t>4. Scope</w:t>
+      </w:r>
+    </w:p>
+    <w:p>
+      <w:pPr>
+        <w:spacing w:line="360" w:lineRule="auto"/>
+        <w:ind w:left="360"/>
+        <w:rPr>
+          <w:sz w:val="28"/>
+          <w:szCs w:val="28"/>
+        </w:rPr>
+      </w:pPr>
+      <w:r>
+        <w:rPr>
+          <w:sz w:val="28"/>
+          <w:szCs w:val="28"/>
+        </w:rPr>
+        <w:t>Committed scope must be baselined and controlled.</w:t>
+      </w:r>
+    </w:p>
+    <w:p>
+      <w:pPr>
+        <w:spacing w:line="360" w:lineRule="auto"/>
+        <w:ind w:left="360"/>
+        <w:rPr>
+          <w:sz w:val="28"/>
+          <w:szCs w:val="28"/>
+        </w:rPr>
+      </w:pPr>
+      <w:r>
+        <w:rPr>
+          <w:sz w:val="28"/>
+          <w:szCs w:val="28"/>
+        </w:rPr>
+        <w:lastRenderedPageBreak/>
+        <w:t>Scope creep is unacceptable.</w:t>
+      </w:r>
+    </w:p>
+    <w:p>
+      <w:pPr>
+        <w:spacing w:line="360" w:lineRule="auto"/>
+        <w:ind w:left="360"/>
+        <w:rPr>
+          <w:sz w:val="28"/>
+          <w:szCs w:val="28"/>
+        </w:rPr>
+      </w:pPr>
+      <w:r>
+        <w:rPr>
+          <w:sz w:val="28"/>
+          <w:szCs w:val="28"/>
+        </w:rPr>
+        <w:t>Changes to the scope baseline need to follow the team's agreed change control process and be documented.</w:t>
+      </w:r>
+    </w:p>
+    <w:p>
+      <w:pPr>
+        <w:spacing w:line="360" w:lineRule="auto"/>
+        <w:ind w:left="360"/>
+        <w:rPr>
+          <w:sz w:val="28"/>
+          <w:szCs w:val="28"/>
+        </w:rPr>
+      </w:pPr>
+      <w:r>
+        <w:rPr>
+          <w:b/>
+          <w:bCs/>
+          <w:sz w:val="28"/>
+          <w:szCs w:val="28"/>
+        </w:rPr>
+        <w:t>5. Security</w:t>
+      </w:r>
+    </w:p>
+    <w:p>
+      <w:pPr>
+        <w:spacing w:line="360" w:lineRule="auto"/>
+        <w:ind w:left="360"/>
+        <w:rPr>
+          <w:sz w:val="28"/>
+          <w:szCs w:val="28"/>
+        </w:rPr>
+      </w:pPr>
+      <w:r>
+        <w:rPr>
+          <w:sz w:val="28"/>
+          <w:szCs w:val="28"/>
+        </w:rPr>
+        <w:t>The system must not contain severe security vulnerabilities at security testing. Evidence: security testing results.</w:t>
+      </w:r>
+    </w:p>
+    <w:p>
+      <w:pPr>
+        <w:spacing w:line="360" w:lineRule="auto"/>
+        <w:ind w:left="360"/>
+        <w:rPr>
+          <w:sz w:val="28"/>
+          <w:szCs w:val="28"/>
+        </w:rPr>
+      </w:pPr>
+      <w:r>
+        <w:rPr>
+          <w:b/>
+          <w:bCs/>
+          <w:sz w:val="28"/>
+          <w:szCs w:val="28"/>
+        </w:rPr>
+        <w:t>Constraint Interactions / Trade-offs</w:t>
+      </w:r>
+    </w:p>
+    <w:p>
+      <w:pPr>
+        <w:spacing w:line="360" w:lineRule="auto"/>
+        <w:ind w:left="360"/>
+        <w:rPr>
+          <w:sz w:val="28"/>
+          <w:szCs w:val="28"/>
+        </w:rPr>
+      </w:pPr>
+      <w:r>
+        <w:rPr>
+          <w:b/>
+          <w:bCs/>
+          <w:sz w:val="28"/>
+          <w:szCs w:val="28"/>
+        </w:rPr>
+        <w:t>Scope and Schedule</w:t>
+      </w:r>
+    </w:p>
+    <w:p>
+      <w:pPr>
+        <w:spacing w:line="360" w:lineRule="auto"/>
+        <w:ind w:left="360"/>
+        <w:rPr>
+          <w:sz w:val="28"/>
+          <w:szCs w:val="28"/>
+        </w:rPr>
+      </w:pPr>
+      <w:r>
+        <w:rPr>
+          <w:sz w:val="28"/>
+          <w:szCs w:val="28"/>
+        </w:rPr>
+        <w:t>Because our schedule is a fixed commitment, more functionality increases scope while still being constrained by the deadlines.</w:t>
+      </w:r>
+    </w:p>
+    <w:p>
+      <w:pPr>
+        <w:spacing w:line="360" w:lineRule="auto"/>
+        <w:ind w:left="360"/>
+        <w:rPr>
+          <w:sz w:val="28"/>
+          <w:szCs w:val="28"/>
+        </w:rPr>
+      </w:pPr>
+      <w:r>
+        <w:rPr>
+          <w:sz w:val="28"/>
+          <w:szCs w:val="28"/>
+        </w:rPr>
+        <w:t>This could lead to reducing scope, quality or testing effort, an increased workload, and a risk of missing the deadline or delivering an incomplete project.</w:t>
+      </w:r>
+    </w:p>
+    <w:p>
+      <w:pPr>
+        <w:spacing w:line="360" w:lineRule="auto"/>
+        <w:ind w:left="360"/>
+        <w:rPr>
+          <w:sz w:val="28"/>
+          <w:szCs w:val="28"/>
+        </w:rPr>
+      </w:pPr>
+      <w:r>
+        <w:rPr>
+          <w:b/>
+          <w:bCs/>
+          <w:sz w:val="28"/>
+          <w:szCs w:val="28"/>
+        </w:rPr>
+        <w:t>Team Size and Schedule</w:t>
+      </w:r>
+    </w:p>
+    <w:p>
+      <w:pPr>
+        <w:spacing w:line="360" w:lineRule="auto"/>
+        <w:ind w:left="360"/>
+        <w:rPr>
+          <w:sz w:val="28"/>
+          <w:szCs w:val="28"/>
+        </w:rPr>
+      </w:pPr>
+      <w:r>
+        <w:rPr>
+          <w:sz w:val="28"/>
+          <w:szCs w:val="28"/>
+        </w:rPr>
+        <w:t>We are restricted to three team members and fixed deadlines, giving us limited time and limited resources.</w:t>
+      </w:r>
+    </w:p>
+    <w:p>
+      <w:pPr>
+        <w:spacing w:line="360" w:lineRule="auto"/>
+        <w:ind w:left="360"/>
+        <w:rPr>
+          <w:sz w:val="28"/>
+          <w:szCs w:val="28"/>
+        </w:rPr>
+      </w:pPr>
+      <w:r>
+        <w:rPr>
+          <w:sz w:val="28"/>
+          <w:szCs w:val="28"/>
+        </w:rPr>
+        <w:t xml:space="preserve">This forces us to work carefully without unnecessary scope </w:t>
+      </w:r>
+      <w:proofErr w:type="gramStart"/>
+      <w:r>
+        <w:rPr>
+          <w:sz w:val="28"/>
+          <w:szCs w:val="28"/>
+        </w:rPr>
+        <w:t>increases, and</w:t>
+      </w:r>
+      <w:proofErr w:type="gramEnd"/>
+      <w:r>
+        <w:rPr>
+          <w:sz w:val="28"/>
+          <w:szCs w:val="28"/>
+        </w:rPr>
+        <w:t xml:space="preserve"> can lead to a rush to meet deadlines and reduced quality </w:t>
+      </w:r>
+      <w:proofErr w:type="gramStart"/>
+      <w:r>
+        <w:rPr>
+          <w:sz w:val="28"/>
+          <w:szCs w:val="28"/>
+        </w:rPr>
+        <w:t>in order to</w:t>
+      </w:r>
+      <w:proofErr w:type="gramEnd"/>
+      <w:r>
+        <w:rPr>
+          <w:sz w:val="28"/>
+          <w:szCs w:val="28"/>
+        </w:rPr>
+        <w:t xml:space="preserve"> stay on schedule.</w:t>
+      </w:r>
+    </w:p>
+    <w:p>
+      <w:pPr>
+        <w:spacing w:line="360" w:lineRule="auto"/>
+        <w:ind w:left="360"/>
+        <w:rPr>
+          <w:sz w:val="28"/>
+          <w:szCs w:val="28"/>
+        </w:rPr>
+      </w:pPr>
+    </w:p>
+    <w:p>
+      <w:pPr>
+        <w:spacing w:line="360" w:lineRule="auto"/>
+        <w:ind w:left="360"/>
+        <w:rPr>
+          <w:sz w:val="28"/>
+          <w:szCs w:val="28"/>
+        </w:rPr>
+      </w:pPr>
+    </w:p>
+    <w:p>
+      <w:pPr>
+        <w:spacing w:line="360" w:lineRule="auto"/>
+        <w:ind w:left="360"/>
+        <w:rPr>
+          <w:sz w:val="28"/>
+          <w:szCs w:val="28"/>
+        </w:rPr>
+      </w:pPr>
+    </w:p>
+    <w:p>
+      <w:pPr>
+        <w:spacing w:line="360" w:lineRule="auto"/>
+        <w:ind w:left="360"/>
+        <w:rPr>
+          <w:sz w:val="28"/>
+          <w:szCs w:val="28"/>
+        </w:rPr>
+      </w:pPr>
+    </w:p>
+    <w:p>
+      <w:pPr>
+        <w:spacing w:line="360" w:lineRule="auto"/>
+        <w:ind w:left="360"/>
+        <w:rPr>
+          <w:sz w:val="28"/>
+          <w:szCs w:val="28"/>
+        </w:rPr>
+      </w:pPr>
+    </w:p>
+    <w:p>
+      <w:pPr>
+        <w:spacing w:line="360" w:lineRule="auto"/>
+        <w:ind w:left="360"/>
+        <w:rPr>
+          <w:sz w:val="28"/>
+          <w:szCs w:val="28"/>
+        </w:rPr>
+      </w:pPr>
+    </w:p>
+    <w:p>
+      <w:pPr>
+        <w:spacing w:line="360" w:lineRule="auto"/>
+        <w:ind w:left="360"/>
+        <w:rPr>
+          <w:sz w:val="28"/>
+          <w:szCs w:val="28"/>
+        </w:rPr>
+      </w:pPr>
+    </w:p>
+    <w:tbl>
+      <w:tblPr>
+        <w:tblStyle w:val="TableGrid"/>
+        <w:tblpPr w:leftFromText="180" w:rightFromText="180" w:vertAnchor="text" w:horzAnchor="margin" w:tblpXSpec="center" w:tblpY="389"/>
+        <w:tblW w:w="10766" w:type="dxa"/>
+        <w:tblLook w:val="04A0" w:firstRow="1" w:lastRow="0" w:firstColumn="1" w:lastColumn="0" w:noHBand="0" w:noVBand="1"/>
+      </w:tblPr>
+      <w:tblGrid>
+        <w:gridCol w:w="1745"/>
+        <w:gridCol w:w="1780"/>
+        <w:gridCol w:w="1765"/>
+        <w:gridCol w:w="1781"/>
+        <w:gridCol w:w="1788"/>
+        <w:gridCol w:w="1907"/>
+      </w:tblGrid>
+      <w:tr>
+        <w:trPr>
+          <w:trHeight w:val="326"/>
+        </w:trPr>
+        <w:tc>
+          <w:tcPr>
+            <w:tcW w:w="1745" w:type="dxa"/>
+          </w:tcPr>
+          <w:p>
+            <w:r>
+              <w:lastRenderedPageBreak/>
+              <w:t>No.</w:t>
+            </w:r>
+          </w:p>
+        </w:tc>
+        <w:tc>
+          <w:tcPr>
+            <w:tcW w:w="1780" w:type="dxa"/>
+          </w:tcPr>
+          <w:p>
+            <w:r>
+              <w:t>Decision</w:t>
+            </w:r>
+          </w:p>
+        </w:tc>
+        <w:tc>
+          <w:tcPr>
+            <w:tcW w:w="1765" w:type="dxa"/>
+          </w:tcPr>
+          <w:p>
+            <w:r>
+              <w:t>Status</w:t>
+            </w:r>
+          </w:p>
+        </w:tc>
+        <w:tc>
+          <w:tcPr>
+            <w:tcW w:w="1781" w:type="dxa"/>
+          </w:tcPr>
+          <w:p>
+            <w:r>
+              <w:t>Reason</w:t>
+            </w:r>
+          </w:p>
+        </w:tc>
+        <w:tc>
+          <w:tcPr>
+            <w:tcW w:w="1788" w:type="dxa"/>
+          </w:tcPr>
+          <w:p>
+            <w:r>
+              <w:t>Evidence</w:t>
+            </w:r>
+          </w:p>
+        </w:tc>
+        <w:tc>
+          <w:tcPr>
+            <w:tcW w:w="1907" w:type="dxa"/>
+          </w:tcPr>
+          <w:p>
+            <w:r>
+              <w:t>Impact</w:t>
+            </w:r>
+          </w:p>
+        </w:tc>
+      </w:tr>
+      <w:tr>
+        <w:trPr>
+          <w:trHeight w:val="1716"/>
+        </w:trPr>
+        <w:tc>
+          <w:tcPr>
+            <w:tcW w:w="1745" w:type="dxa"/>
+          </w:tcPr>
+          <w:p>
+            <w:r>
+              <w:t>1</w:t>
+            </w:r>
+          </w:p>
+        </w:tc>
+        <w:tc>
+          <w:tcPr>
+            <w:tcW w:w="1780" w:type="dxa"/>
+          </w:tcPr>
+          <w:p>
+            <w:pPr>
+              <w:rPr>
+                <w:rFonts w:ascii="Times New Roman" w:hAnsi="Times New Roman" w:cs="Times New Roman"/>
+                <w:sz w:val="22"/>
+                <w:szCs w:val="22"/>
+              </w:rPr>
+            </w:pPr>
+            <w:r>
+              <w:rPr>
+                <w:rFonts w:ascii="Times New Roman" w:hAnsi="Times New Roman" w:cs="Times New Roman"/>
+                <w:sz w:val="22"/>
+                <w:szCs w:val="22"/>
+              </w:rPr>
+              <w:t>Technology stack</w:t>
+            </w:r>
+          </w:p>
+        </w:tc>
+        <w:tc>
+          <w:tcPr>
+            <w:tcW w:w="1765" w:type="dxa"/>
+          </w:tcPr>
+          <w:p>
+            <w:pPr>
+              <w:rPr>
+                <w:rFonts w:ascii="Times New Roman" w:hAnsi="Times New Roman" w:cs="Times New Roman"/>
+                <w:sz w:val="22"/>
+                <w:szCs w:val="22"/>
+              </w:rPr>
+            </w:pPr>
+            <w:r>
+              <w:rPr>
+                <w:rFonts w:ascii="Times New Roman" w:hAnsi="Times New Roman" w:cs="Times New Roman"/>
+                <w:sz w:val="22"/>
+                <w:szCs w:val="22"/>
+              </w:rPr>
+              <w:t>De</w:t>
+            </w:r>
+            <w:r>
+              <w:rPr>
+                <w:rFonts w:ascii="Times New Roman" w:hAnsi="Times New Roman" w:cs="Times New Roman"/>
+                <w:sz w:val="22"/>
+                <w:szCs w:val="22"/>
+              </w:rPr>
+              <w:t>ferred</w:t>
+            </w:r>
+          </w:p>
+        </w:tc>
+        <w:tc>
+          <w:tcPr>
+            <w:tcW w:w="1781" w:type="dxa"/>
+          </w:tcPr>
+          <w:p>
+            <w:pPr>
+              <w:rPr>
+                <w:rFonts w:ascii="Times New Roman" w:hAnsi="Times New Roman" w:cs="Times New Roman"/>
+                <w:sz w:val="22"/>
+                <w:szCs w:val="22"/>
+              </w:rPr>
+            </w:pPr>
+            <w:r>
+              <w:rPr>
+                <w:rFonts w:ascii="Times New Roman" w:hAnsi="Times New Roman" w:cs="Times New Roman"/>
+                <w:sz w:val="22"/>
+                <w:szCs w:val="22"/>
+              </w:rPr>
+              <w:t>Insufficient information available for milestone 1</w:t>
+            </w:r>
+          </w:p>
+        </w:tc>
+        <w:tc>
+          <w:tcPr>
+            <w:tcW w:w="1788" w:type="dxa"/>
+          </w:tcPr>
+          <w:p>
+            <w:pPr>
+              <w:rPr>
+                <w:rFonts w:ascii="Times New Roman" w:hAnsi="Times New Roman" w:cs="Times New Roman"/>
+                <w:sz w:val="22"/>
+                <w:szCs w:val="22"/>
+              </w:rPr>
+            </w:pPr>
+            <w:r>
+              <w:rPr>
+                <w:rFonts w:ascii="Times New Roman" w:hAnsi="Times New Roman" w:cs="Times New Roman"/>
+                <w:sz w:val="22"/>
+                <w:szCs w:val="22"/>
+              </w:rPr>
+              <w:t>Technology needs and requirements yet to be completed</w:t>
+            </w:r>
+          </w:p>
+        </w:tc>
+        <w:tc>
+          <w:tcPr>
+            <w:tcW w:w="1907" w:type="dxa"/>
+          </w:tcPr>
+          <w:p>
+            <w:pPr>
+              <w:rPr>
+                <w:rFonts w:ascii="Times New Roman" w:hAnsi="Times New Roman" w:cs="Times New Roman"/>
+                <w:sz w:val="22"/>
+                <w:szCs w:val="22"/>
+              </w:rPr>
+            </w:pPr>
+            <w:r>
+              <w:rPr>
+                <w:rFonts w:ascii="Times New Roman" w:hAnsi="Times New Roman" w:cs="Times New Roman"/>
+                <w:sz w:val="22"/>
+                <w:szCs w:val="22"/>
+              </w:rPr>
+              <w:t>May influence</w:t>
+            </w:r>
+            <w:r>
+              <w:rPr>
+                <w:rFonts w:ascii="Times New Roman" w:hAnsi="Times New Roman" w:cs="Times New Roman"/>
+                <w:sz w:val="22"/>
+                <w:szCs w:val="22"/>
+              </w:rPr>
+              <w:t xml:space="preserve"> architecture, implementation and decisions for further milestones</w:t>
+            </w:r>
+            <w:r>
+              <w:rPr>
+                <w:rFonts w:ascii="Times New Roman" w:hAnsi="Times New Roman" w:cs="Times New Roman"/>
+                <w:sz w:val="22"/>
+                <w:szCs w:val="22"/>
+              </w:rPr>
+              <w:t xml:space="preserve"> </w:t>
+            </w:r>
+          </w:p>
+        </w:tc>
+      </w:tr>
+      <w:tr>
+        <w:trPr>
+          <w:trHeight w:val="2865"/>
+        </w:trPr>
+        <w:tc>
+          <w:tcPr>
+            <w:tcW w:w="1745" w:type="dxa"/>
+          </w:tcPr>
+          <w:p>
+            <w:pPr>
+              <w:rPr>
+                <w:rFonts w:ascii="Times New Roman" w:hAnsi="Times New Roman" w:cs="Times New Roman"/>
+                <w:sz w:val="22"/>
+                <w:szCs w:val="22"/>
+              </w:rPr>
+            </w:pPr>
+            <w:r>
+              <w:rPr>
+                <w:rFonts w:ascii="Times New Roman" w:hAnsi="Times New Roman" w:cs="Times New Roman"/>
+                <w:sz w:val="22"/>
+                <w:szCs w:val="22"/>
+              </w:rPr>
+              <w:t>2</w:t>
+            </w:r>
+          </w:p>
+        </w:tc>
+        <w:tc>
+          <w:tcPr>
+            <w:tcW w:w="1780" w:type="dxa"/>
+          </w:tcPr>
+          <w:p>
+            <w:pPr>
+              <w:rPr>
+                <w:rFonts w:ascii="Times New Roman" w:hAnsi="Times New Roman" w:cs="Times New Roman"/>
+                <w:sz w:val="22"/>
+                <w:szCs w:val="22"/>
+              </w:rPr>
+            </w:pPr>
+            <w:r>
+              <w:rPr>
+                <w:rFonts w:ascii="Times New Roman" w:hAnsi="Times New Roman" w:cs="Times New Roman"/>
+                <w:sz w:val="22"/>
+                <w:szCs w:val="22"/>
+              </w:rPr>
+              <w:t>Architecture</w:t>
+            </w:r>
+          </w:p>
+        </w:tc>
+        <w:tc>
+          <w:tcPr>
+            <w:tcW w:w="1765" w:type="dxa"/>
+          </w:tcPr>
+          <w:p>
+            <w:pPr>
+              <w:rPr>
+                <w:rFonts w:ascii="Times New Roman" w:hAnsi="Times New Roman" w:cs="Times New Roman"/>
+                <w:sz w:val="22"/>
+                <w:szCs w:val="22"/>
+              </w:rPr>
+            </w:pPr>
+            <w:r>
+              <w:rPr>
+                <w:rFonts w:ascii="Times New Roman" w:hAnsi="Times New Roman" w:cs="Times New Roman"/>
+                <w:sz w:val="22"/>
+                <w:szCs w:val="22"/>
+              </w:rPr>
+              <w:t>Deferred</w:t>
+            </w:r>
+          </w:p>
+        </w:tc>
+        <w:tc>
+          <w:tcPr>
+            <w:tcW w:w="1781" w:type="dxa"/>
+          </w:tcPr>
+          <w:p>
+            <w:pPr>
+              <w:rPr>
+                <w:rFonts w:ascii="Times New Roman" w:hAnsi="Times New Roman" w:cs="Times New Roman"/>
+                <w:sz w:val="22"/>
+                <w:szCs w:val="22"/>
+              </w:rPr>
+            </w:pPr>
+            <w:r>
+              <w:rPr>
+                <w:rFonts w:ascii="Times New Roman" w:hAnsi="Times New Roman" w:cs="Times New Roman"/>
+                <w:sz w:val="22"/>
+                <w:szCs w:val="22"/>
+              </w:rPr>
+              <w:t>Our current research for milestone 1 will be used to make an informed decision</w:t>
+            </w:r>
+          </w:p>
+        </w:tc>
+        <w:tc>
+          <w:tcPr>
+            <w:tcW w:w="1788" w:type="dxa"/>
+          </w:tcPr>
+          <w:p>
+            <w:pPr>
+              <w:rPr>
+                <w:rFonts w:ascii="Times New Roman" w:hAnsi="Times New Roman" w:cs="Times New Roman"/>
+                <w:sz w:val="22"/>
+                <w:szCs w:val="22"/>
+              </w:rPr>
+            </w:pPr>
+            <w:r>
+              <w:rPr>
+                <w:rFonts w:ascii="Times New Roman" w:hAnsi="Times New Roman" w:cs="Times New Roman"/>
+                <w:sz w:val="22"/>
+                <w:szCs w:val="22"/>
+              </w:rPr>
+              <w:t>Milestone 1 explains the requirements and constraints, giving us the information after completing our research.</w:t>
+            </w:r>
+          </w:p>
+        </w:tc>
+        <w:tc>
+          <w:tcPr>
+            <w:tcW w:w="1907" w:type="dxa"/>
+          </w:tcPr>
+          <w:p>
+            <w:pPr>
+              <w:rPr>
+                <w:rFonts w:ascii="Times New Roman" w:hAnsi="Times New Roman" w:cs="Times New Roman"/>
+                <w:sz w:val="22"/>
+                <w:szCs w:val="22"/>
+              </w:rPr>
+            </w:pPr>
+            <w:r>
+              <w:rPr>
+                <w:rFonts w:ascii="Times New Roman" w:hAnsi="Times New Roman" w:cs="Times New Roman"/>
+                <w:sz w:val="22"/>
+                <w:szCs w:val="22"/>
+              </w:rPr>
+              <w:t>Architecture will be decided after Milestone 1. Most likely before or when starting with milestone 2</w:t>
+            </w:r>
+          </w:p>
+        </w:tc>
+      </w:tr>
+      <w:tr>
+        <w:trPr>
+          <w:trHeight w:val="2284"/>
+        </w:trPr>
+        <w:tc>
+          <w:tcPr>
+            <w:tcW w:w="1745" w:type="dxa"/>
+          </w:tcPr>
+          <w:p>
+            <w:r>
+              <w:t>3</w:t>
+            </w:r>
+          </w:p>
+        </w:tc>
+        <w:tc>
+          <w:tcPr>
+            <w:tcW w:w="1780" w:type="dxa"/>
+          </w:tcPr>
+          <w:p>
+            <w:pPr>
+              <w:rPr>
+                <w:rFonts w:ascii="Times New Roman" w:hAnsi="Times New Roman" w:cs="Times New Roman"/>
+                <w:sz w:val="22"/>
+                <w:szCs w:val="22"/>
+              </w:rPr>
+            </w:pPr>
+            <w:r>
+              <w:rPr>
+                <w:rFonts w:ascii="Times New Roman" w:hAnsi="Times New Roman" w:cs="Times New Roman"/>
+                <w:sz w:val="22"/>
+                <w:szCs w:val="22"/>
+              </w:rPr>
+              <w:t>Baseline and scope</w:t>
+            </w:r>
+          </w:p>
+        </w:tc>
+        <w:tc>
+          <w:tcPr>
+            <w:tcW w:w="1765" w:type="dxa"/>
+          </w:tcPr>
+          <w:p>
+            <w:pPr>
+              <w:rPr>
+                <w:rFonts w:ascii="Times New Roman" w:hAnsi="Times New Roman" w:cs="Times New Roman"/>
+                <w:sz w:val="22"/>
+                <w:szCs w:val="22"/>
+              </w:rPr>
+            </w:pPr>
+            <w:r>
+              <w:rPr>
+                <w:rFonts w:ascii="Times New Roman" w:hAnsi="Times New Roman" w:cs="Times New Roman"/>
+                <w:sz w:val="22"/>
+                <w:szCs w:val="22"/>
+              </w:rPr>
+              <w:t>Decided</w:t>
+            </w:r>
+          </w:p>
+        </w:tc>
+        <w:tc>
+          <w:tcPr>
+            <w:tcW w:w="1781" w:type="dxa"/>
+          </w:tcPr>
+          <w:p>
+            <w:pPr>
+              <w:rPr>
+                <w:rFonts w:ascii="Times New Roman" w:hAnsi="Times New Roman" w:cs="Times New Roman"/>
+                <w:sz w:val="22"/>
+                <w:szCs w:val="22"/>
+              </w:rPr>
+            </w:pPr>
+            <w:r>
+              <w:rPr>
+                <w:rFonts w:ascii="Times New Roman" w:hAnsi="Times New Roman" w:cs="Times New Roman"/>
+                <w:sz w:val="22"/>
+                <w:szCs w:val="22"/>
+              </w:rPr>
+              <w:t>Avoid scope creep, mainly affected by schedule and quality.</w:t>
+            </w:r>
+          </w:p>
+        </w:tc>
+        <w:tc>
+          <w:tcPr>
+            <w:tcW w:w="1788" w:type="dxa"/>
+          </w:tcPr>
+          <w:p>
+            <w:pPr>
+              <w:rPr>
+                <w:rFonts w:ascii="Times New Roman" w:hAnsi="Times New Roman" w:cs="Times New Roman"/>
+                <w:sz w:val="22"/>
+                <w:szCs w:val="22"/>
+              </w:rPr>
+            </w:pPr>
+            <w:r>
+              <w:rPr>
+                <w:rFonts w:ascii="Times New Roman" w:hAnsi="Times New Roman" w:cs="Times New Roman"/>
+                <w:sz w:val="22"/>
+                <w:szCs w:val="22"/>
+              </w:rPr>
+              <w:t xml:space="preserve">Our scope and constraints analysis. </w:t>
+            </w:r>
+          </w:p>
+        </w:tc>
+        <w:tc>
+          <w:tcPr>
+            <w:tcW w:w="1907" w:type="dxa"/>
+          </w:tcPr>
+          <w:p>
+            <w:pPr>
+              <w:rPr>
+                <w:rFonts w:ascii="Times New Roman" w:hAnsi="Times New Roman" w:cs="Times New Roman"/>
+                <w:sz w:val="22"/>
+                <w:szCs w:val="22"/>
+              </w:rPr>
+            </w:pPr>
+            <w:r>
+              <w:rPr>
+                <w:rFonts w:ascii="Times New Roman" w:hAnsi="Times New Roman" w:cs="Times New Roman"/>
+                <w:sz w:val="22"/>
+                <w:szCs w:val="22"/>
+              </w:rPr>
+              <w:t>Future scope change must first be evaluated and properly documented before being accepted.</w:t>
+            </w:r>
+          </w:p>
+        </w:tc>
+      </w:tr>
+      <w:tr>
+        <w:trPr>
+          <w:trHeight w:val="3150"/>
+        </w:trPr>
+        <w:tc>
+          <w:tcPr>
+            <w:tcW w:w="1745" w:type="dxa"/>
+          </w:tcPr>
+          <w:p>
+            <w:r>
+              <w:t>4</w:t>
+            </w:r>
+          </w:p>
+        </w:tc>
+        <w:tc>
+          <w:tcPr>
+            <w:tcW w:w="1780" w:type="dxa"/>
+          </w:tcPr>
+          <w:p>
+            <w:pPr>
+              <w:rPr>
+                <w:rFonts w:ascii="Times New Roman" w:hAnsi="Times New Roman" w:cs="Times New Roman"/>
+                <w:sz w:val="22"/>
+                <w:szCs w:val="22"/>
+              </w:rPr>
+            </w:pPr>
+            <w:r>
+              <w:rPr>
+                <w:rFonts w:ascii="Times New Roman" w:hAnsi="Times New Roman" w:cs="Times New Roman"/>
+                <w:sz w:val="22"/>
+                <w:szCs w:val="22"/>
+              </w:rPr>
+              <w:t>GitHub Control</w:t>
+            </w:r>
+          </w:p>
+        </w:tc>
+        <w:tc>
+          <w:tcPr>
+            <w:tcW w:w="1765" w:type="dxa"/>
+          </w:tcPr>
+          <w:p>
+            <w:pPr>
+              <w:rPr>
+                <w:rFonts w:ascii="Times New Roman" w:hAnsi="Times New Roman" w:cs="Times New Roman"/>
+                <w:sz w:val="22"/>
+                <w:szCs w:val="22"/>
+              </w:rPr>
+            </w:pPr>
+            <w:r>
+              <w:rPr>
+                <w:rFonts w:ascii="Times New Roman" w:hAnsi="Times New Roman" w:cs="Times New Roman"/>
+                <w:sz w:val="22"/>
+                <w:szCs w:val="22"/>
+              </w:rPr>
+              <w:t>Direct main changes not allowed, branches, requests and documented commits only allowed and pushed one approval is given</w:t>
+            </w:r>
+          </w:p>
+        </w:tc>
+        <w:tc>
+          <w:tcPr>
+            <w:tcW w:w="1781" w:type="dxa"/>
+          </w:tcPr>
+          <w:p>
+            <w:pPr>
+              <w:rPr>
+                <w:rFonts w:ascii="Times New Roman" w:hAnsi="Times New Roman" w:cs="Times New Roman"/>
+                <w:sz w:val="22"/>
+                <w:szCs w:val="22"/>
+              </w:rPr>
+            </w:pPr>
+            <w:r>
+              <w:rPr>
+                <w:rFonts w:ascii="Times New Roman" w:hAnsi="Times New Roman" w:cs="Times New Roman"/>
+                <w:sz w:val="22"/>
+                <w:szCs w:val="22"/>
+              </w:rPr>
+              <w:t>Requested to be used as well as allows for controlled reviews and traceable changes</w:t>
+            </w:r>
+          </w:p>
+        </w:tc>
+        <w:tc>
+          <w:tcPr>
+            <w:tcW w:w="1788" w:type="dxa"/>
+          </w:tcPr>
+          <w:p>
+            <w:pPr>
+              <w:rPr>
+                <w:rFonts w:ascii="Times New Roman" w:hAnsi="Times New Roman" w:cs="Times New Roman"/>
+                <w:sz w:val="22"/>
+                <w:szCs w:val="22"/>
+              </w:rPr>
+            </w:pPr>
+            <w:r>
+              <w:rPr>
+                <w:rFonts w:ascii="Times New Roman" w:hAnsi="Times New Roman" w:cs="Times New Roman"/>
+                <w:sz w:val="22"/>
+                <w:szCs w:val="22"/>
+              </w:rPr>
+              <w:t>Milestone 1 GitHub governance requirement</w:t>
+            </w:r>
+          </w:p>
+        </w:tc>
+        <w:tc>
+          <w:tcPr>
+            <w:tcW w:w="1907" w:type="dxa"/>
+          </w:tcPr>
+          <w:p>
+            <w:pPr>
+              <w:rPr>
+                <w:rFonts w:ascii="Times New Roman" w:hAnsi="Times New Roman" w:cs="Times New Roman"/>
+                <w:sz w:val="22"/>
+                <w:szCs w:val="22"/>
+              </w:rPr>
+            </w:pPr>
+            <w:r>
+              <w:rPr>
+                <w:rFonts w:ascii="Times New Roman" w:hAnsi="Times New Roman" w:cs="Times New Roman"/>
+                <w:sz w:val="22"/>
+                <w:szCs w:val="22"/>
+              </w:rPr>
+              <w:t xml:space="preserve">Creates evidence of team collaborations, avoids uncontrolled changes to the baseline. </w:t>
+            </w:r>
+          </w:p>
+        </w:tc>
+      </w:tr>
+    </w:tbl>
+    <w:p>
+      <w:pPr>
+        <w:rPr>
+          <w:b/>
+          <w:bCs/>
+          <w:sz w:val="28"/>
+          <w:szCs w:val="28"/>
+        </w:rPr>
+      </w:pPr>
+      <w:r>
+        <w:rPr>
+          <w:b/>
+          <w:bCs/>
+          <w:sz w:val="28"/>
+          <w:szCs w:val="28"/>
+        </w:rPr>
+        <w:t>Engineering Decision Log</w:t>
+      </w:r>
+      <w:r>
+        <w:rPr>
+          <w:b/>
+          <w:bCs/>
+          <w:sz w:val="28"/>
+          <w:szCs w:val="28"/>
+        </w:rPr>
+        <w:t>:</w:t>
+      </w:r>
+    </w:p>
+    <w:p/>
+    <w:p/>
+    <w:p/>
+    <w:p/>
+    <w:p/>
+    <w:p/>
+    <w:p/>
+    <w:p/>
+    <w:p/>
+    <w:p>
+      <w:pPr>
+        <w:rPr>
+          <w:b/>
+          <w:bCs/>
+          <w:sz w:val="28"/>
+          <w:szCs w:val="28"/>
+        </w:rPr>
+      </w:pPr>
+      <w:r>
+        <w:rPr>
+          <w:b/>
+          <w:bCs/>
+          <w:sz w:val="28"/>
+          <w:szCs w:val="28"/>
+        </w:rPr>
+        <w:lastRenderedPageBreak/>
+        <w:t>AI usage register:</w:t>
+      </w:r>
+    </w:p>
+    <w:tbl>
+      <w:tblPr>
+        <w:tblStyle w:val="TableGrid"/>
+        <w:tblpPr w:leftFromText="180" w:rightFromText="180" w:vertAnchor="text" w:horzAnchor="margin" w:tblpXSpec="center" w:tblpY="64"/>
+        <w:tblW w:w="11301" w:type="dxa"/>
+        <w:tblLook w:val="04A0" w:firstRow="1" w:lastRow="0" w:firstColumn="1" w:lastColumn="0" w:noHBand="0" w:noVBand="1"/>
+      </w:tblPr>
+      <w:tblGrid>
+        <w:gridCol w:w="630"/>
+        <w:gridCol w:w="1551"/>
+        <w:gridCol w:w="1207"/>
+        <w:gridCol w:w="1296"/>
+        <w:gridCol w:w="1789"/>
+        <w:gridCol w:w="1733"/>
+        <w:gridCol w:w="1576"/>
+        <w:gridCol w:w="1519"/>
+      </w:tblGrid>
+      <w:tr>
+        <w:trPr>
+          <w:trHeight w:val="1142"/>
+        </w:trPr>
+        <w:tc>
+          <w:tcPr>
+            <w:tcW w:w="630" w:type="dxa"/>
+          </w:tcPr>
+          <w:p>
+            <w:pPr>
+              <w:rPr>
+                <w:rFonts w:ascii="Times New Roman" w:hAnsi="Times New Roman" w:cs="Times New Roman"/>
+                <w:sz w:val="22"/>
+                <w:szCs w:val="22"/>
+              </w:rPr>
+            </w:pPr>
+            <w:r>
+              <w:rPr>
+                <w:rFonts w:ascii="Times New Roman" w:hAnsi="Times New Roman" w:cs="Times New Roman"/>
+                <w:sz w:val="22"/>
+                <w:szCs w:val="22"/>
+              </w:rPr>
+              <w:t>No.</w:t>
+            </w:r>
+          </w:p>
+        </w:tc>
+        <w:tc>
+          <w:tcPr>
+            <w:tcW w:w="1551" w:type="dxa"/>
+          </w:tcPr>
+          <w:p>
+            <w:r>
+              <w:t>Date</w:t>
+            </w:r>
+          </w:p>
+        </w:tc>
+        <w:tc>
+          <w:tcPr>
+            <w:tcW w:w="1207" w:type="dxa"/>
+          </w:tcPr>
+          <w:p>
+            <w:r>
+              <w:t>User</w:t>
+            </w:r>
+          </w:p>
+        </w:tc>
+        <w:tc>
+          <w:tcPr>
+            <w:tcW w:w="1296" w:type="dxa"/>
+          </w:tcPr>
+          <w:p>
+            <w:r>
+              <w:t>AI tool</w:t>
+            </w:r>
+          </w:p>
+        </w:tc>
+        <w:tc>
+          <w:tcPr>
+            <w:tcW w:w="1789" w:type="dxa"/>
+          </w:tcPr>
+          <w:p>
+            <w:r>
+              <w:t>Task</w:t>
+            </w:r>
+          </w:p>
+        </w:tc>
+        <w:tc>
+          <w:tcPr>
+            <w:tcW w:w="1733" w:type="dxa"/>
+          </w:tcPr>
+          <w:p>
+            <w:r>
+              <w:t>AI Contribution</w:t>
+            </w:r>
+          </w:p>
+        </w:tc>
+        <w:tc>
+          <w:tcPr>
+            <w:tcW w:w="1576" w:type="dxa"/>
+          </w:tcPr>
+          <w:p>
+            <w:r>
+              <w:t>Human Verification</w:t>
+            </w:r>
+          </w:p>
+        </w:tc>
+        <w:tc>
+          <w:tcPr>
+            <w:tcW w:w="1519" w:type="dxa"/>
+          </w:tcPr>
+          <w:p>
+            <w:r>
+              <w:t>Outcome</w:t>
+            </w:r>
+          </w:p>
+        </w:tc>
+      </w:tr>
+      <w:tr>
+        <w:trPr>
+          <w:trHeight w:val="3428"/>
+        </w:trPr>
+        <w:tc>
+          <w:tcPr>
+            <w:tcW w:w="630" w:type="dxa"/>
+          </w:tcPr>
+          <w:p>
+            <w:pPr>
+              <w:rPr>
+                <w:rFonts w:ascii="Times New Roman" w:hAnsi="Times New Roman" w:cs="Times New Roman"/>
+                <w:sz w:val="22"/>
+                <w:szCs w:val="22"/>
+              </w:rPr>
+            </w:pPr>
+            <w:r>
+              <w:t>1</w:t>
+            </w:r>
+          </w:p>
+        </w:tc>
+        <w:tc>
+          <w:tcPr>
+            <w:tcW w:w="1551" w:type="dxa"/>
+          </w:tcPr>
+          <w:p>
+            <w:pPr>
+              <w:rPr>
+                <w:rFonts w:ascii="Times New Roman" w:hAnsi="Times New Roman" w:cs="Times New Roman"/>
+                <w:sz w:val="22"/>
+                <w:szCs w:val="22"/>
+              </w:rPr>
+            </w:pPr>
+            <w:r>
+              <w:rPr>
+                <w:rFonts w:ascii="Times New Roman" w:hAnsi="Times New Roman" w:cs="Times New Roman"/>
+                <w:sz w:val="22"/>
+                <w:szCs w:val="22"/>
+              </w:rPr>
+              <w:t>07 September 2026</w:t>
+            </w:r>
+          </w:p>
+        </w:tc>
+        <w:tc>
+          <w:tcPr>
+            <w:tcW w:w="1207" w:type="dxa"/>
+          </w:tcPr>
+          <w:p>
+            <w:r>
+              <w:t>Herman</w:t>
+            </w:r>
+          </w:p>
+        </w:tc>
+        <w:tc>
+          <w:tcPr>
+            <w:tcW w:w="1296" w:type="dxa"/>
+          </w:tcPr>
+          <w:p>
+            <w:r>
+              <w:t>ChatGPT</w:t>
+            </w:r>
+          </w:p>
+        </w:tc>
+        <w:tc>
+          <w:tcPr>
+            <w:tcW w:w="1789" w:type="dxa"/>
+          </w:tcPr>
+          <w:p>
+            <w:r>
+              <w:t>Engineering Decision Log Creation</w:t>
+            </w:r>
+          </w:p>
+        </w:tc>
+        <w:tc>
+          <w:tcPr>
+            <w:tcW w:w="1733" w:type="dxa"/>
+          </w:tcPr>
+          <w:p>
+            <w:r>
+              <w:t>Explained and gave examples of what a proper EDL should look like</w:t>
+            </w:r>
+          </w:p>
+        </w:tc>
+        <w:tc>
+          <w:tcPr>
+            <w:tcW w:w="1576" w:type="dxa"/>
+          </w:tcPr>
+          <w:p>
+            <w:r>
+              <w:t>Based on other projects and internet sources compared AI given example</w:t>
+            </w:r>
+          </w:p>
+        </w:tc>
+        <w:tc>
+          <w:tcPr>
+            <w:tcW w:w="1519" w:type="dxa"/>
+          </w:tcPr>
+          <w:p>
+            <w:r>
+              <w:t>Accepted example and made use to create our EDL</w:t>
+            </w:r>
+          </w:p>
+        </w:tc>
+      </w:tr>
+      <w:tr>
+        <w:trPr>
+          <w:trHeight w:val="3443"/>
+        </w:trPr>
+        <w:tc>
+          <w:tcPr>
+            <w:tcW w:w="630" w:type="dxa"/>
+          </w:tcPr>
+          <w:p>
+            <w:r>
+              <w:t>2</w:t>
+            </w:r>
+          </w:p>
+        </w:tc>
+        <w:tc>
+          <w:tcPr>
+            <w:tcW w:w="1551" w:type="dxa"/>
+          </w:tcPr>
+          <w:p>
+            <w:r>
+              <w:t>07 September</w:t>
+            </w:r>
+          </w:p>
+        </w:tc>
+        <w:tc>
+          <w:tcPr>
+            <w:tcW w:w="1207" w:type="dxa"/>
+          </w:tcPr>
+          <w:p>
+            <w:r>
+              <w:t>Jason</w:t>
+            </w:r>
+          </w:p>
+        </w:tc>
+        <w:tc>
+          <w:tcPr>
+            <w:tcW w:w="1296" w:type="dxa"/>
+          </w:tcPr>
+          <w:p>
+            <w:r>
+              <w:t>ChatGPT</w:t>
+            </w:r>
+          </w:p>
+        </w:tc>
+        <w:tc>
+          <w:tcPr>
+            <w:tcW w:w="1789" w:type="dxa"/>
+          </w:tcPr>
+          <w:p>
+            <w:r>
+              <w:t>Construction of md file</w:t>
+            </w:r>
+          </w:p>
+        </w:tc>
+        <w:tc>
+          <w:tcPr>
+            <w:tcW w:w="1733" w:type="dxa"/>
+          </w:tcPr>
+          <w:p>
+            <w:r>
+              <w:t>Suggested format and proper spelling</w:t>
+            </w:r>
+          </w:p>
+        </w:tc>
+        <w:tc>
+          <w:tcPr>
+            <w:tcW w:w="1576" w:type="dxa"/>
+          </w:tcPr>
+          <w:p>
+            <w:r>
+              <w:t>Reviewed suggestion made changes and used suggestion only as design guideline</w:t>
+            </w:r>
+          </w:p>
+        </w:tc>
+        <w:tc>
+          <w:tcPr>
+            <w:tcW w:w="1519" w:type="dxa"/>
+          </w:tcPr>
+          <w:p>
+            <w:r>
+              <w:t>Accepted suggestion as visual guideline</w:t>
+            </w:r>
+          </w:p>
+        </w:tc>
+      </w:tr>
+    </w:tbl>
+    <w:p/>
+    <w:p/>
+    <w:p>
+      <w:pPr>
+        <w:spacing w:line="360" w:lineRule="auto"/>
+        <w:ind w:left="360"/>
+        <w:rPr>
+          <w:sz w:val="28"/>
+          <w:szCs w:val="28"/>
+        </w:rPr>
+      </w:pPr>
+    </w:p>
+    <w:p>
+      <w:pPr>
+        <w:spacing w:line="360" w:lineRule="auto"/>
+        <w:ind w:left="360"/>
+        <w:rPr>
+          <w:sz w:val="28"/>
+          <w:szCs w:val="28"/>
+        </w:rPr>
+      </w:pPr>
     </w:p>
     <w:p>
       <w:pPr>

</xml_diff>